<commit_message>
docs(user-guide): réorganiser le manuel selon l'ordre du menu latéral
Réordonne la table des matières et les sections du corps du document
pour suivre l'ordre exact des items du menu (MainLayout.jsx) : Dashboard,
Établissements, Élèves, Paiements, Scan Réfectoire, Historique, Rapports,
Utilisateurs, Parents, Configuration — Thèmes et À Propos (hors menu
latéral) restent en fin de document. Seul le module Rapports (§14→§9)
change de position ; renumérotation en cascade des sections 9→14
touchées, contenu et captures inchangés. PDF régénéré à l'identique.

Co-Authored-By: Claude Sonnet 5 <noreply@anthropic.com>
</commit_message>
<xml_diff>
--- a/collaboration/doc/user-guide.docx
+++ b/collaboration/doc/user-guide.docx
@@ -830,7 +830,7 @@
         <w:rPr>
           <w:rFonts w:asciiTheme="majorHAnsi" w:hAnsiTheme="majorHAnsi"/>
         </w:rPr>
-        <w:t>Module Utilisateurs (Admin)</w:t>
+        <w:t>Module Rapports (nouveau)</w:t>
       </w:r>
     </w:p>
     <w:p>
@@ -849,37 +849,7 @@
         <w:rPr>
           <w:rFonts w:asciiTheme="majorHAnsi" w:hAnsiTheme="majorHAnsi"/>
         </w:rPr>
-        <w:t xml:space="preserve">Module </w:t>
-      </w:r>
-      <w:r>
-        <w:rPr>
-          <w:rFonts w:asciiTheme="majorHAnsi" w:hAnsiTheme="majorHAnsi"/>
-        </w:rPr>
-        <w:t>Parents</w:t>
-      </w:r>
-      <w:r>
-        <w:rPr>
-          <w:rFonts w:asciiTheme="majorHAnsi" w:hAnsiTheme="majorHAnsi"/>
-        </w:rPr>
-        <w:t xml:space="preserve"> </w:t>
-      </w:r>
-      <w:r>
-        <w:rPr>
-          <w:rFonts w:asciiTheme="majorHAnsi" w:hAnsiTheme="majorHAnsi"/>
-        </w:rPr>
-        <w:t>(</w:t>
-      </w:r>
-      <w:r>
-        <w:rPr>
-          <w:rFonts w:asciiTheme="majorHAnsi" w:hAnsiTheme="majorHAnsi"/>
-        </w:rPr>
-        <w:t>Administrateur</w:t>
-      </w:r>
-      <w:r>
-        <w:rPr>
-          <w:rFonts w:asciiTheme="majorHAnsi" w:hAnsiTheme="majorHAnsi"/>
-        </w:rPr>
-        <w:t>)</w:t>
+        <w:t>Module Utilisateurs (Admin)</w:t>
       </w:r>
     </w:p>
     <w:p>
@@ -898,7 +868,37 @@
         <w:rPr>
           <w:rFonts w:asciiTheme="majorHAnsi" w:hAnsiTheme="majorHAnsi"/>
         </w:rPr>
-        <w:t>Configuration</w:t>
+        <w:t xml:space="preserve">Module </w:t>
+      </w:r>
+      <w:r>
+        <w:rPr>
+          <w:rFonts w:asciiTheme="majorHAnsi" w:hAnsiTheme="majorHAnsi"/>
+        </w:rPr>
+        <w:t>Parents</w:t>
+      </w:r>
+      <w:r>
+        <w:rPr>
+          <w:rFonts w:asciiTheme="majorHAnsi" w:hAnsiTheme="majorHAnsi"/>
+        </w:rPr>
+        <w:t xml:space="preserve"> </w:t>
+      </w:r>
+      <w:r>
+        <w:rPr>
+          <w:rFonts w:asciiTheme="majorHAnsi" w:hAnsiTheme="majorHAnsi"/>
+        </w:rPr>
+        <w:t>(</w:t>
+      </w:r>
+      <w:r>
+        <w:rPr>
+          <w:rFonts w:asciiTheme="majorHAnsi" w:hAnsiTheme="majorHAnsi"/>
+        </w:rPr>
+        <w:t>Administrateur</w:t>
+      </w:r>
+      <w:r>
+        <w:rPr>
+          <w:rFonts w:asciiTheme="majorHAnsi" w:hAnsiTheme="majorHAnsi"/>
+        </w:rPr>
+        <w:t>)</w:t>
       </w:r>
     </w:p>
     <w:p>
@@ -917,7 +917,7 @@
         <w:rPr>
           <w:rFonts w:asciiTheme="majorHAnsi" w:hAnsiTheme="majorHAnsi"/>
         </w:rPr>
-        <w:t>Personnalisation de l'interface (Thèmes)</w:t>
+        <w:t>Configuration</w:t>
       </w:r>
     </w:p>
     <w:p>
@@ -936,7 +936,7 @@
         <w:rPr>
           <w:rFonts w:asciiTheme="majorHAnsi" w:hAnsiTheme="majorHAnsi"/>
         </w:rPr>
-        <w:t>Fenêtre À Propos</w:t>
+        <w:t>Personnalisation de l'interface (Thèmes)</w:t>
       </w:r>
     </w:p>
     <w:p>
@@ -955,7 +955,7 @@
         <w:rPr>
           <w:rFonts w:asciiTheme="majorHAnsi" w:hAnsiTheme="majorHAnsi"/>
         </w:rPr>
-        <w:t>Module Rapports (nouveau)</w:t>
+        <w:t>Fenêtre À Propos</w:t>
       </w:r>
     </w:p>
     <w:p>
@@ -8835,8 +8835,550 @@
           <w:sz w:val="22"/>
           <w:szCs w:val="22"/>
         </w:rPr>
-        <w:lastRenderedPageBreak/>
-        <w:t>9. Module Utilisateurs (Administrateur)</w:t>
+        <w:t>9. Module Rapports</w:t>
+      </w:r>
+    </w:p>
+    <w:p>
+      <w:pPr>
+        <w:spacing w:after="160"/>
+        <w:rPr>
+          <w:rFonts w:asciiTheme="majorHAnsi" w:hAnsiTheme="majorHAnsi"/>
+        </w:rPr>
+      </w:pPr>
+      <w:r>
+        <w:rPr>
+          <w:rFonts w:asciiTheme="majorHAnsi" w:hAnsiTheme="majorHAnsi"/>
+        </w:rPr>
+        <w:t>Ce module (première version exploratoire) permet à un Gestionnaire, un Caissier ou un Administrateur de générer des états financiers, statistiques, paiements et passages sur une période donnée, puis de les exporter en Excel ou de les imprimer en PDF. Non accessible au rôle Parent.</w:t>
+      </w:r>
+    </w:p>
+    <w:tbl>
+      <w:tblPr>
+        <w:tblW w:type="auto" w:w="0"/>
+        <w:tblLook w:firstColumn="1" w:firstRow="1" w:lastColumn="0" w:lastRow="0" w:noHBand="0" w:noVBand="1" w:val="04A0"/>
+      </w:tblPr>
+      <w:tblGrid>
+        <w:gridCol w:w="10080"/>
+      </w:tblGrid>
+      <w:tr>
+        <w:tc>
+          <w:tcPr>
+            <w:tcW w:w="6252" w:type="dxa"/>
+            <w:tcBorders>
+              <w:top w:val="single" w:sz="4" w:space="0" w:color="CCCCCC"/>
+              <w:left w:val="single" w:sz="4" w:space="0" w:color="CCCCCC"/>
+              <w:bottom w:val="single" w:sz="4" w:space="0" w:color="CCCCCC"/>
+              <w:right w:val="single" w:sz="4" w:space="0" w:color="CCCCCC"/>
+            </w:tcBorders>
+            <w:tcMar>
+              <w:top w:w="100" w:type="dxa"/>
+              <w:left w:w="100" w:type="dxa"/>
+              <w:bottom w:w="100" w:type="dxa"/>
+              <w:right w:w="100" w:type="dxa"/>
+            </w:tcMar>
+          </w:tcPr>
+          <w:p>
+            <w:pPr>
+              <w:jc w:val="center"/>
+              <w:rPr>
+                <w:rFonts w:asciiTheme="majorHAnsi" w:hAnsiTheme="majorHAnsi"/>
+              </w:rPr>
+            </w:pPr>
+            <w:r>
+              <w:drawing>
+                <wp:inline xmlns:a="http://schemas.openxmlformats.org/drawingml/2006/main" xmlns:pic="http://schemas.openxmlformats.org/drawingml/2006/picture">
+                  <wp:extent cx="5486400" cy="3227832"/>
+                  <wp:docPr id="1883468449" name="Picture 1883468449"/>
+                  <wp:cNvGraphicFramePr>
+                    <a:graphicFrameLocks noChangeAspect="1"/>
+                  </wp:cNvGraphicFramePr>
+                  <a:graphic>
+                    <a:graphicData uri="http://schemas.openxmlformats.org/drawingml/2006/picture">
+                      <pic:pic>
+                        <pic:nvPicPr>
+                          <pic:cNvPr id="0" name="rapports-resume.png"/>
+                          <pic:cNvPicPr/>
+                        </pic:nvPicPr>
+                        <pic:blipFill>
+                          <a:blip r:embed="rId33"/>
+                          <a:stretch>
+                            <a:fillRect/>
+                          </a:stretch>
+                        </pic:blipFill>
+                        <pic:spPr>
+                          <a:xfrm>
+                            <a:off x="0" y="0"/>
+                            <a:ext cx="5486400" cy="3227832"/>
+                          </a:xfrm>
+                          <a:prstGeom prst="rect"/>
+                        </pic:spPr>
+                      </pic:pic>
+                    </a:graphicData>
+                  </a:graphic>
+                </wp:inline>
+              </w:drawing>
+            </w:r>
+          </w:p>
+        </w:tc>
+      </w:tr>
+    </w:tbl>
+    <w:p>
+      <w:pPr>
+        <w:spacing w:before="100" w:after="200"/>
+        <w:jc w:val="center"/>
+        <w:rPr>
+          <w:rFonts w:asciiTheme="majorHAnsi" w:hAnsiTheme="majorHAnsi"/>
+        </w:rPr>
+      </w:pPr>
+      <w:r>
+        <w:rPr>
+          <w:rFonts w:asciiTheme="majorHAnsi" w:hAnsiTheme="majorHAnsi"/>
+          <w:i/>
+          <w:iCs/>
+          <w:color w:val="555555"/>
+        </w:rPr>
+        <w:t>Module Rapports — filtres de période, onglet Résumé (montant encaissé, paiements acceptés, passages accordés, taux d'accès)</w:t>
+      </w:r>
+    </w:p>
+    <w:p>
+      <w:pPr>
+        <w:pStyle w:val="Titre2"/>
+        <w:rPr>
+          <w:rFonts w:asciiTheme="majorHAnsi" w:hAnsiTheme="majorHAnsi"/>
+          <w:sz w:val="22"/>
+          <w:szCs w:val="22"/>
+        </w:rPr>
+      </w:pPr>
+      <w:r>
+        <w:rPr>
+          <w:rFonts w:asciiTheme="majorHAnsi" w:hAnsiTheme="majorHAnsi"/>
+          <w:sz w:val="22"/>
+          <w:szCs w:val="22"/>
+        </w:rPr>
+        <w:t>9.1 Générer un rapport</w:t>
+      </w:r>
+    </w:p>
+    <w:p>
+      <w:pPr>
+        <w:pStyle w:val="Paragraphedeliste"/>
+        <w:numPr>
+          <w:ilvl w:val="0"/>
+          <w:numId w:val="3"/>
+        </w:numPr>
+        <w:spacing w:after="80"/>
+        <w:rPr>
+          <w:rFonts w:asciiTheme="majorHAnsi" w:hAnsiTheme="majorHAnsi"/>
+        </w:rPr>
+      </w:pPr>
+      <w:r>
+        <w:rPr>
+          <w:rFonts w:asciiTheme="majorHAnsi" w:hAnsiTheme="majorHAnsi"/>
+        </w:rPr>
+        <w:t>Cliquez sur 📊 Rapports dans le menu.</w:t>
+      </w:r>
+    </w:p>
+    <w:p>
+      <w:pPr>
+        <w:pStyle w:val="Paragraphedeliste"/>
+        <w:numPr>
+          <w:ilvl w:val="0"/>
+          <w:numId w:val="3"/>
+        </w:numPr>
+        <w:spacing w:after="80"/>
+        <w:rPr>
+          <w:rFonts w:asciiTheme="majorHAnsi" w:hAnsiTheme="majorHAnsi"/>
+        </w:rPr>
+      </w:pPr>
+      <w:r>
+        <w:rPr>
+          <w:rFonts w:asciiTheme="majorHAnsi" w:hAnsiTheme="majorHAnsi"/>
+        </w:rPr>
+        <w:t>Choisissez une Date début et une Date fin.</w:t>
+      </w:r>
+    </w:p>
+    <w:p>
+      <w:pPr>
+        <w:pStyle w:val="Paragraphedeliste"/>
+        <w:numPr>
+          <w:ilvl w:val="0"/>
+          <w:numId w:val="3"/>
+        </w:numPr>
+        <w:spacing w:after="80"/>
+        <w:rPr>
+          <w:rFonts w:asciiTheme="majorHAnsi" w:hAnsiTheme="majorHAnsi"/>
+        </w:rPr>
+      </w:pPr>
+      <w:r>
+        <w:rPr>
+          <w:rFonts w:asciiTheme="majorHAnsi" w:hAnsiTheme="majorHAnsi"/>
+        </w:rPr>
+        <w:t>(Optionnel) Sélectionnez un Établissement pour restreindre les passages du rapport.</w:t>
+      </w:r>
+    </w:p>
+    <w:p>
+      <w:pPr>
+        <w:pStyle w:val="Paragraphedeliste"/>
+        <w:numPr>
+          <w:ilvl w:val="0"/>
+          <w:numId w:val="3"/>
+        </w:numPr>
+        <w:spacing w:after="80"/>
+        <w:rPr>
+          <w:rFonts w:asciiTheme="majorHAnsi" w:hAnsiTheme="majorHAnsi"/>
+        </w:rPr>
+      </w:pPr>
+      <w:r>
+        <w:rPr>
+          <w:rFonts w:asciiTheme="majorHAnsi" w:hAnsiTheme="majorHAnsi"/>
+        </w:rPr>
+        <w:t>Cliquez sur Générer le rapport.</w:t>
+      </w:r>
+    </w:p>
+    <w:p>
+      <w:pPr>
+        <w:pStyle w:val="Titre2"/>
+        <w:rPr>
+          <w:rFonts w:asciiTheme="majorHAnsi" w:hAnsiTheme="majorHAnsi"/>
+          <w:sz w:val="22"/>
+          <w:szCs w:val="22"/>
+        </w:rPr>
+      </w:pPr>
+      <w:r>
+        <w:rPr>
+          <w:rFonts w:asciiTheme="majorHAnsi" w:hAnsiTheme="majorHAnsi"/>
+          <w:sz w:val="22"/>
+          <w:szCs w:val="22"/>
+        </w:rPr>
+        <w:t>9.2 Onglets Résumé / Paiements / Passages</w:t>
+      </w:r>
+    </w:p>
+    <w:p>
+      <w:pPr>
+        <w:spacing w:after="160"/>
+        <w:rPr>
+          <w:rFonts w:asciiTheme="majorHAnsi" w:hAnsiTheme="majorHAnsi"/>
+        </w:rPr>
+      </w:pPr>
+      <w:r>
+        <w:rPr>
+          <w:rFonts w:asciiTheme="majorHAnsi" w:hAnsiTheme="majorHAnsi"/>
+        </w:rPr>
+        <w:t>Une fois le rapport généré, trois onglets structurent le contenu :</w:t>
+      </w:r>
+    </w:p>
+    <w:p>
+      <w:pPr>
+        <w:pStyle w:val="Paragraphedeliste"/>
+        <w:numPr>
+          <w:ilvl w:val="0"/>
+          <w:numId w:val="3"/>
+        </w:numPr>
+        <w:spacing w:after="80"/>
+        <w:rPr>
+          <w:rFonts w:asciiTheme="majorHAnsi" w:hAnsiTheme="majorHAnsi"/>
+        </w:rPr>
+      </w:pPr>
+      <w:r>
+        <w:rPr>
+          <w:rFonts w:asciiTheme="majorHAnsi" w:hAnsiTheme="majorHAnsi"/>
+        </w:rPr>
+        <w:t>Résumé — indicateurs clés : montant total encaissé, répartition des paiements par statut, répartition des passages par résultat, taux d'accès</w:t>
+      </w:r>
+    </w:p>
+    <w:p>
+      <w:pPr>
+        <w:pStyle w:val="Paragraphedeliste"/>
+        <w:numPr>
+          <w:ilvl w:val="0"/>
+          <w:numId w:val="3"/>
+        </w:numPr>
+        <w:spacing w:after="80"/>
+        <w:rPr>
+          <w:rFonts w:asciiTheme="majorHAnsi" w:hAnsiTheme="majorHAnsi"/>
+        </w:rPr>
+      </w:pPr>
+      <w:r>
+        <w:rPr>
+          <w:rFonts w:asciiTheme="majorHAnsi" w:hAnsiTheme="majorHAnsi"/>
+        </w:rPr>
+        <w:t>Paiements — liste détaillée des transactions de la période</w:t>
+      </w:r>
+    </w:p>
+    <w:p>
+      <w:pPr>
+        <w:pStyle w:val="Paragraphedeliste"/>
+        <w:numPr>
+          <w:ilvl w:val="0"/>
+          <w:numId w:val="3"/>
+        </w:numPr>
+        <w:spacing w:after="80"/>
+        <w:rPr>
+          <w:rFonts w:asciiTheme="majorHAnsi" w:hAnsiTheme="majorHAnsi"/>
+        </w:rPr>
+      </w:pPr>
+      <w:r>
+        <w:rPr>
+          <w:rFonts w:asciiTheme="majorHAnsi" w:hAnsiTheme="majorHAnsi"/>
+        </w:rPr>
+        <w:t>Passages — liste détaillée des passages réfectoire de la période</w:t>
+      </w:r>
+    </w:p>
+    <w:tbl>
+      <w:tblPr>
+        <w:tblW w:type="auto" w:w="0"/>
+        <w:tblLook w:firstColumn="1" w:firstRow="1" w:lastColumn="0" w:lastRow="0" w:noHBand="0" w:noVBand="1" w:val="04A0"/>
+      </w:tblPr>
+      <w:tblGrid>
+        <w:gridCol w:w="10080"/>
+      </w:tblGrid>
+      <w:tr>
+        <w:tc>
+          <w:tcPr>
+            <w:tcW w:w="6252" w:type="dxa"/>
+            <w:tcBorders>
+              <w:top w:val="single" w:sz="4" w:space="0" w:color="CCCCCC"/>
+              <w:left w:val="single" w:sz="4" w:space="0" w:color="CCCCCC"/>
+              <w:bottom w:val="single" w:sz="4" w:space="0" w:color="CCCCCC"/>
+              <w:right w:val="single" w:sz="4" w:space="0" w:color="CCCCCC"/>
+            </w:tcBorders>
+            <w:tcMar>
+              <w:top w:w="100" w:type="dxa"/>
+              <w:left w:w="100" w:type="dxa"/>
+              <w:bottom w:w="100" w:type="dxa"/>
+              <w:right w:w="100" w:type="dxa"/>
+            </w:tcMar>
+          </w:tcPr>
+          <w:p>
+            <w:pPr>
+              <w:jc w:val="center"/>
+              <w:rPr>
+                <w:rFonts w:asciiTheme="majorHAnsi" w:hAnsiTheme="majorHAnsi"/>
+              </w:rPr>
+            </w:pPr>
+            <w:r>
+              <w:drawing>
+                <wp:inline xmlns:a="http://schemas.openxmlformats.org/drawingml/2006/main" xmlns:pic="http://schemas.openxmlformats.org/drawingml/2006/picture">
+                  <wp:extent cx="5486400" cy="2834640"/>
+                  <wp:docPr id="1883468450" name="Picture 1883468450"/>
+                  <wp:cNvGraphicFramePr>
+                    <a:graphicFrameLocks noChangeAspect="1"/>
+                  </wp:cNvGraphicFramePr>
+                  <a:graphic>
+                    <a:graphicData uri="http://schemas.openxmlformats.org/drawingml/2006/picture">
+                      <pic:pic>
+                        <pic:nvPicPr>
+                          <pic:cNvPr id="0" name="rapports-paiements.png"/>
+                          <pic:cNvPicPr/>
+                        </pic:nvPicPr>
+                        <pic:blipFill>
+                          <a:blip r:embed="rId34"/>
+                          <a:stretch>
+                            <a:fillRect/>
+                          </a:stretch>
+                        </pic:blipFill>
+                        <pic:spPr>
+                          <a:xfrm>
+                            <a:off x="0" y="0"/>
+                            <a:ext cx="5486400" cy="2834640"/>
+                          </a:xfrm>
+                          <a:prstGeom prst="rect"/>
+                        </pic:spPr>
+                      </pic:pic>
+                    </a:graphicData>
+                  </a:graphic>
+                </wp:inline>
+              </w:drawing>
+            </w:r>
+          </w:p>
+        </w:tc>
+      </w:tr>
+    </w:tbl>
+    <w:p>
+      <w:pPr>
+        <w:spacing w:before="100" w:after="200"/>
+        <w:jc w:val="center"/>
+        <w:rPr>
+          <w:rFonts w:asciiTheme="majorHAnsi" w:hAnsiTheme="majorHAnsi"/>
+        </w:rPr>
+      </w:pPr>
+      <w:r>
+        <w:rPr>
+          <w:rFonts w:asciiTheme="majorHAnsi" w:hAnsiTheme="majorHAnsi"/>
+          <w:i/>
+          <w:iCs/>
+          <w:color w:val="555555"/>
+        </w:rPr>
+        <w:t>Onglet Paiements du rapport — liste détaillée de la période sélectionnée</w:t>
+      </w:r>
+    </w:p>
+    <w:tbl>
+      <w:tblPr>
+        <w:tblW w:type="auto" w:w="0"/>
+        <w:tblLook w:firstColumn="1" w:firstRow="1" w:lastColumn="0" w:lastRow="0" w:noHBand="0" w:noVBand="1" w:val="04A0"/>
+      </w:tblPr>
+      <w:tblGrid>
+        <w:gridCol w:w="10080"/>
+      </w:tblGrid>
+      <w:tr>
+        <w:tc>
+          <w:tcPr>
+            <w:tcW w:w="6252" w:type="dxa"/>
+            <w:tcBorders>
+              <w:top w:val="single" w:sz="4" w:space="0" w:color="CCCCCC"/>
+              <w:left w:val="single" w:sz="4" w:space="0" w:color="CCCCCC"/>
+              <w:bottom w:val="single" w:sz="4" w:space="0" w:color="CCCCCC"/>
+              <w:right w:val="single" w:sz="4" w:space="0" w:color="CCCCCC"/>
+            </w:tcBorders>
+            <w:tcMar>
+              <w:top w:w="100" w:type="dxa"/>
+              <w:left w:w="100" w:type="dxa"/>
+              <w:bottom w:w="100" w:type="dxa"/>
+              <w:right w:w="100" w:type="dxa"/>
+            </w:tcMar>
+          </w:tcPr>
+          <w:p>
+            <w:pPr>
+              <w:jc w:val="center"/>
+              <w:rPr>
+                <w:rFonts w:asciiTheme="majorHAnsi" w:hAnsiTheme="majorHAnsi"/>
+              </w:rPr>
+            </w:pPr>
+            <w:r>
+              <w:drawing>
+                <wp:inline xmlns:a="http://schemas.openxmlformats.org/drawingml/2006/main" xmlns:pic="http://schemas.openxmlformats.org/drawingml/2006/picture">
+                  <wp:extent cx="5486400" cy="2834640"/>
+                  <wp:docPr id="1883468451" name="Picture 1883468451"/>
+                  <wp:cNvGraphicFramePr>
+                    <a:graphicFrameLocks noChangeAspect="1"/>
+                  </wp:cNvGraphicFramePr>
+                  <a:graphic>
+                    <a:graphicData uri="http://schemas.openxmlformats.org/drawingml/2006/picture">
+                      <pic:pic>
+                        <pic:nvPicPr>
+                          <pic:cNvPr id="0" name="rapports-passages.png"/>
+                          <pic:cNvPicPr/>
+                        </pic:nvPicPr>
+                        <pic:blipFill>
+                          <a:blip r:embed="rId35"/>
+                          <a:stretch>
+                            <a:fillRect/>
+                          </a:stretch>
+                        </pic:blipFill>
+                        <pic:spPr>
+                          <a:xfrm>
+                            <a:off x="0" y="0"/>
+                            <a:ext cx="5486400" cy="2834640"/>
+                          </a:xfrm>
+                          <a:prstGeom prst="rect"/>
+                        </pic:spPr>
+                      </pic:pic>
+                    </a:graphicData>
+                  </a:graphic>
+                </wp:inline>
+              </w:drawing>
+            </w:r>
+          </w:p>
+        </w:tc>
+      </w:tr>
+    </w:tbl>
+    <w:p>
+      <w:pPr>
+        <w:spacing w:before="100" w:after="200"/>
+        <w:jc w:val="center"/>
+        <w:rPr>
+          <w:rFonts w:asciiTheme="majorHAnsi" w:hAnsiTheme="majorHAnsi"/>
+        </w:rPr>
+      </w:pPr>
+      <w:r>
+        <w:rPr>
+          <w:rFonts w:asciiTheme="majorHAnsi" w:hAnsiTheme="majorHAnsi"/>
+          <w:i/>
+          <w:iCs/>
+          <w:color w:val="555555"/>
+        </w:rPr>
+        <w:t>Onglet Passages du rapport — liste détaillée des passages réfectoire de la période</w:t>
+      </w:r>
+    </w:p>
+    <w:p>
+      <w:pPr>
+        <w:pStyle w:val="Titre2"/>
+        <w:rPr>
+          <w:rFonts w:asciiTheme="majorHAnsi" w:hAnsiTheme="majorHAnsi"/>
+          <w:sz w:val="22"/>
+          <w:szCs w:val="22"/>
+        </w:rPr>
+      </w:pPr>
+      <w:r>
+        <w:rPr>
+          <w:rFonts w:asciiTheme="majorHAnsi" w:hAnsiTheme="majorHAnsi"/>
+          <w:sz w:val="22"/>
+          <w:szCs w:val="22"/>
+        </w:rPr>
+        <w:t>9.3 Exporter en Excel</w:t>
+      </w:r>
+    </w:p>
+    <w:p>
+      <w:pPr>
+        <w:spacing w:after="160"/>
+        <w:rPr>
+          <w:rFonts w:asciiTheme="majorHAnsi" w:hAnsiTheme="majorHAnsi"/>
+        </w:rPr>
+      </w:pPr>
+      <w:r>
+        <w:rPr>
+          <w:rFonts w:asciiTheme="majorHAnsi" w:hAnsiTheme="majorHAnsi"/>
+        </w:rPr>
+        <w:t>Le bouton Exporter Excel télécharge un classeur .xlsx contenant 3 feuilles — Résumé, Paiements et Passages — couvrant toute la période sélectionnée (pas seulement les lignes visibles à l'écran).</w:t>
+      </w:r>
+    </w:p>
+    <w:p>
+      <w:pPr>
+        <w:pStyle w:val="Titre2"/>
+        <w:rPr>
+          <w:rFonts w:asciiTheme="majorHAnsi" w:hAnsiTheme="majorHAnsi"/>
+          <w:sz w:val="22"/>
+          <w:szCs w:val="22"/>
+        </w:rPr>
+      </w:pPr>
+      <w:r>
+        <w:rPr>
+          <w:rFonts w:asciiTheme="majorHAnsi" w:hAnsiTheme="majorHAnsi"/>
+          <w:sz w:val="22"/>
+          <w:szCs w:val="22"/>
+        </w:rPr>
+        <w:t>9.4 Imprimer / PDF</w:t>
+      </w:r>
+    </w:p>
+    <w:p>
+      <w:pPr>
+        <w:spacing w:after="160"/>
+        <w:rPr>
+          <w:rFonts w:asciiTheme="majorHAnsi" w:hAnsiTheme="majorHAnsi"/>
+        </w:rPr>
+      </w:pPr>
+      <w:r>
+        <w:rPr>
+          <w:rFonts w:asciiTheme="majorHAnsi" w:hAnsiTheme="majorHAnsi"/>
+        </w:rPr>
+        <w:t>Sur chaque onglet, le bouton Imprimer / PDF ouvre la boîte de dialogue d'impression du navigateur, limitée au contenu de l'onglet actif. Choisissez « Enregistrer au format PDF » comme imprimante pour obtenir un fichier PDF.</w:t>
+      </w:r>
+    </w:p>
+    <w:p>
+      <w:pPr>
+        <w:pStyle w:val="Titre1"/>
+        <w:rPr>
+          <w:rFonts w:asciiTheme="majorHAnsi" w:hAnsiTheme="majorHAnsi"/>
+          <w:sz w:val="22"/>
+          <w:szCs w:val="22"/>
+        </w:rPr>
+      </w:pPr>
+      <w:r>
+        <w:rPr>
+          <w:rFonts w:asciiTheme="majorHAnsi" w:hAnsiTheme="majorHAnsi"/>
+          <w:sz w:val="22"/>
+          <w:szCs w:val="22"/>
+        </w:rPr>
+        <w:t>10. Module Utilisateurs (Administrateur)</w:t>
       </w:r>
     </w:p>
     <w:tbl>
@@ -9082,7 +9624,7 @@
           <w:sz w:val="22"/>
           <w:szCs w:val="22"/>
         </w:rPr>
-        <w:t>9.1 Créer un utilisateur</w:t>
+        <w:t>10.1 Créer un utilisateur</w:t>
       </w:r>
     </w:p>
     <w:p>
@@ -9171,7 +9713,7 @@
           <w:sz w:val="22"/>
           <w:szCs w:val="22"/>
         </w:rPr>
-        <w:t>9.2 Modifier un utilisateur</w:t>
+        <w:t>10.2 Modifier un utilisateur</w:t>
       </w:r>
     </w:p>
     <w:p>
@@ -9229,7 +9771,7 @@
           <w:sz w:val="22"/>
           <w:szCs w:val="22"/>
         </w:rPr>
-        <w:t>9.3 Désactiver / Réactiver</w:t>
+        <w:t>10.3 Désactiver / Réactiver</w:t>
       </w:r>
     </w:p>
     <w:p>
@@ -9261,7 +9803,7 @@
           <w:sz w:val="22"/>
           <w:szCs w:val="22"/>
         </w:rPr>
-        <w:t>9.4 Supprimer définitivement</w:t>
+        <w:t>10.4 Supprimer définitivement</w:t>
       </w:r>
     </w:p>
     <w:p>
@@ -9402,7 +9944,7 @@
           <w:sz w:val="22"/>
           <w:szCs w:val="22"/>
         </w:rPr>
-        <w:t>9.5 Recherche et filtres</w:t>
+        <w:t>10.5 Recherche et filtres</w:t>
       </w:r>
     </w:p>
     <w:p>
@@ -9608,7 +10150,7 @@
           <w:sz w:val="22"/>
           <w:szCs w:val="22"/>
         </w:rPr>
-        <w:t>10</w:t>
+        <w:t>11. Module Parents (Administrateur)</w:t>
       </w:r>
       <w:r>
         <w:rPr>
@@ -9616,7 +10158,6 @@
           <w:sz w:val="22"/>
           <w:szCs w:val="22"/>
         </w:rPr>
-        <w:t xml:space="preserve">. Module </w:t>
       </w:r>
       <w:r>
         <w:rPr>
@@ -9624,7 +10165,6 @@
           <w:sz w:val="22"/>
           <w:szCs w:val="22"/>
         </w:rPr>
-        <w:t>Parents</w:t>
       </w:r>
       <w:r>
         <w:rPr>
@@ -9632,13 +10172,11 @@
           <w:sz w:val="22"/>
           <w:szCs w:val="22"/>
         </w:rPr>
-        <w:t xml:space="preserve"> (</w:t>
-      </w:r>
-      <w:r>
-        <w:rPr>
-          <w:rFonts w:asciiTheme="majorHAnsi" w:hAnsiTheme="majorHAnsi"/>
-        </w:rPr>
-        <w:t>Administrateur</w:t>
+      </w:r>
+      <w:r>
+        <w:rPr>
+          <w:rFonts w:asciiTheme="majorHAnsi" w:hAnsiTheme="majorHAnsi"/>
+        </w:rPr>
       </w:r>
       <w:r>
         <w:rPr>
@@ -9646,7 +10184,6 @@
           <w:sz w:val="22"/>
           <w:szCs w:val="22"/>
         </w:rPr>
-        <w:t>)</w:t>
       </w:r>
     </w:p>
     <w:tbl>
@@ -9984,7 +10521,7 @@
           <w:sz w:val="22"/>
           <w:szCs w:val="22"/>
         </w:rPr>
-        <w:t>10</w:t>
+        <w:t>11.1 Créer un parent</w:t>
       </w:r>
       <w:r>
         <w:rPr>
@@ -9992,7 +10529,6 @@
           <w:sz w:val="22"/>
           <w:szCs w:val="22"/>
         </w:rPr>
-        <w:t xml:space="preserve">.1 Créer un </w:t>
       </w:r>
       <w:r>
         <w:rPr>
@@ -10000,7 +10536,6 @@
           <w:sz w:val="22"/>
           <w:szCs w:val="22"/>
         </w:rPr>
-        <w:t>parent</w:t>
       </w:r>
     </w:p>
     <w:p>
@@ -10099,7 +10634,7 @@
           <w:sz w:val="22"/>
           <w:szCs w:val="22"/>
         </w:rPr>
-        <w:t>10</w:t>
+        <w:t>11.2 Modifier un parent</w:t>
       </w:r>
       <w:r>
         <w:rPr>
@@ -10107,7 +10642,6 @@
           <w:sz w:val="22"/>
           <w:szCs w:val="22"/>
         </w:rPr>
-        <w:t xml:space="preserve">.2 Modifier un </w:t>
       </w:r>
       <w:r>
         <w:rPr>
@@ -10115,7 +10649,6 @@
           <w:sz w:val="22"/>
           <w:szCs w:val="22"/>
         </w:rPr>
-        <w:t>parent</w:t>
       </w:r>
     </w:p>
     <w:p>
@@ -10191,7 +10724,7 @@
           <w:sz w:val="22"/>
           <w:szCs w:val="22"/>
         </w:rPr>
-        <w:t>10</w:t>
+        <w:t>11.3 Supprimer définitivement</w:t>
       </w:r>
       <w:r>
         <w:rPr>
@@ -10199,7 +10732,6 @@
           <w:sz w:val="22"/>
           <w:szCs w:val="22"/>
         </w:rPr>
-        <w:t>.</w:t>
       </w:r>
       <w:r>
         <w:rPr>
@@ -10207,7 +10739,6 @@
           <w:sz w:val="22"/>
           <w:szCs w:val="22"/>
         </w:rPr>
-        <w:t>3</w:t>
       </w:r>
       <w:r>
         <w:rPr>
@@ -10215,7 +10746,6 @@
           <w:sz w:val="22"/>
           <w:szCs w:val="22"/>
         </w:rPr>
-        <w:t xml:space="preserve"> Supprimer définitivement</w:t>
       </w:r>
     </w:p>
     <w:p>
@@ -10343,7 +10873,7 @@
           <w:sz w:val="22"/>
           <w:szCs w:val="22"/>
         </w:rPr>
-        <w:t>10.4 Recherche par email</w:t>
+        <w:t>11.4 Recherche par email</w:t>
       </w:r>
     </w:p>
     <w:p>
@@ -10483,8 +11013,7 @@
           <w:sz w:val="22"/>
           <w:szCs w:val="22"/>
         </w:rPr>
-        <w:lastRenderedPageBreak/>
-        <w:t>1</w:t>
+        <w:t>12. Configuration</w:t>
       </w:r>
       <w:r>
         <w:rPr>
@@ -10492,7 +11021,6 @@
           <w:sz w:val="22"/>
           <w:szCs w:val="22"/>
         </w:rPr>
-        <w:t>1</w:t>
       </w:r>
       <w:r>
         <w:rPr>
@@ -10500,7 +11028,6 @@
           <w:sz w:val="22"/>
           <w:szCs w:val="22"/>
         </w:rPr>
-        <w:t>. Configuration</w:t>
       </w:r>
     </w:p>
     <w:tbl>
@@ -10739,8 +11266,7 @@
           <w:sz w:val="22"/>
           <w:szCs w:val="22"/>
         </w:rPr>
-        <w:lastRenderedPageBreak/>
-        <w:t>1</w:t>
+        <w:t>13. Personnalisation de l'Interface (Thèmes)</w:t>
       </w:r>
       <w:r>
         <w:rPr>
@@ -10748,7 +11274,6 @@
           <w:sz w:val="22"/>
           <w:szCs w:val="22"/>
         </w:rPr>
-        <w:t>2</w:t>
       </w:r>
       <w:r>
         <w:rPr>
@@ -10756,7 +11281,6 @@
           <w:sz w:val="22"/>
           <w:szCs w:val="22"/>
         </w:rPr>
-        <w:t>. Personnalisation de l'Interface (Thèmes)</w:t>
       </w:r>
     </w:p>
     <w:tbl>
@@ -11993,8 +12517,7 @@
           <w:sz w:val="22"/>
           <w:szCs w:val="22"/>
         </w:rPr>
-        <w:lastRenderedPageBreak/>
-        <w:t>1</w:t>
+        <w:t>14. Fenêtre À Propos</w:t>
       </w:r>
       <w:r>
         <w:rPr>
@@ -12002,7 +12525,6 @@
           <w:sz w:val="22"/>
           <w:szCs w:val="22"/>
         </w:rPr>
-        <w:t>3</w:t>
       </w:r>
       <w:r>
         <w:rPr>
@@ -12010,7 +12532,6 @@
           <w:sz w:val="22"/>
           <w:szCs w:val="22"/>
         </w:rPr>
-        <w:t>. Fenêtre À Propos</w:t>
       </w:r>
     </w:p>
     <w:p>
@@ -12194,549 +12715,6 @@
           <w:rFonts w:asciiTheme="majorHAnsi" w:hAnsiTheme="majorHAnsi"/>
         </w:rPr>
       </w:pPr>
-    </w:p>
-    <w:p>
-      <w:pPr>
-        <w:pStyle w:val="Titre1"/>
-        <w:rPr>
-          <w:rFonts w:asciiTheme="majorHAnsi" w:hAnsiTheme="majorHAnsi"/>
-          <w:sz w:val="22"/>
-          <w:szCs w:val="22"/>
-        </w:rPr>
-      </w:pPr>
-      <w:r>
-        <w:rPr>
-          <w:rFonts w:asciiTheme="majorHAnsi" w:hAnsiTheme="majorHAnsi"/>
-          <w:sz w:val="22"/>
-          <w:szCs w:val="22"/>
-        </w:rPr>
-        <w:t>14. Module Rapports</w:t>
-      </w:r>
-    </w:p>
-    <w:p>
-      <w:pPr>
-        <w:spacing w:after="160"/>
-        <w:rPr>
-          <w:rFonts w:asciiTheme="majorHAnsi" w:hAnsiTheme="majorHAnsi"/>
-        </w:rPr>
-      </w:pPr>
-      <w:r>
-        <w:rPr>
-          <w:rFonts w:asciiTheme="majorHAnsi" w:hAnsiTheme="majorHAnsi"/>
-        </w:rPr>
-        <w:t>Ce module (première version exploratoire) permet à un Gestionnaire, un Caissier ou un Administrateur de générer des états financiers, statistiques, paiements et passages sur une période donnée, puis de les exporter en Excel ou de les imprimer en PDF. Non accessible au rôle Parent.</w:t>
-      </w:r>
-    </w:p>
-    <w:tbl>
-      <w:tblPr>
-        <w:tblW w:type="auto" w:w="0"/>
-        <w:tblLook w:firstColumn="1" w:firstRow="1" w:lastColumn="0" w:lastRow="0" w:noHBand="0" w:noVBand="1" w:val="04A0"/>
-      </w:tblPr>
-      <w:tblGrid>
-        <w:gridCol w:w="10080"/>
-      </w:tblGrid>
-      <w:tr>
-        <w:tc>
-          <w:tcPr>
-            <w:tcW w:w="6252" w:type="dxa"/>
-            <w:tcBorders>
-              <w:top w:val="single" w:sz="4" w:space="0" w:color="CCCCCC"/>
-              <w:left w:val="single" w:sz="4" w:space="0" w:color="CCCCCC"/>
-              <w:bottom w:val="single" w:sz="4" w:space="0" w:color="CCCCCC"/>
-              <w:right w:val="single" w:sz="4" w:space="0" w:color="CCCCCC"/>
-            </w:tcBorders>
-            <w:tcMar>
-              <w:top w:w="100" w:type="dxa"/>
-              <w:left w:w="100" w:type="dxa"/>
-              <w:bottom w:w="100" w:type="dxa"/>
-              <w:right w:w="100" w:type="dxa"/>
-            </w:tcMar>
-          </w:tcPr>
-          <w:p>
-            <w:pPr>
-              <w:jc w:val="center"/>
-              <w:rPr>
-                <w:rFonts w:asciiTheme="majorHAnsi" w:hAnsiTheme="majorHAnsi"/>
-              </w:rPr>
-            </w:pPr>
-            <w:r>
-              <w:drawing>
-                <wp:inline xmlns:a="http://schemas.openxmlformats.org/drawingml/2006/main" xmlns:pic="http://schemas.openxmlformats.org/drawingml/2006/picture">
-                  <wp:extent cx="5486400" cy="3227832"/>
-                  <wp:docPr id="1883468449" name="Picture 1883468449"/>
-                  <wp:cNvGraphicFramePr>
-                    <a:graphicFrameLocks noChangeAspect="1"/>
-                  </wp:cNvGraphicFramePr>
-                  <a:graphic>
-                    <a:graphicData uri="http://schemas.openxmlformats.org/drawingml/2006/picture">
-                      <pic:pic>
-                        <pic:nvPicPr>
-                          <pic:cNvPr id="0" name="rapports-resume.png"/>
-                          <pic:cNvPicPr/>
-                        </pic:nvPicPr>
-                        <pic:blipFill>
-                          <a:blip r:embed="rId33"/>
-                          <a:stretch>
-                            <a:fillRect/>
-                          </a:stretch>
-                        </pic:blipFill>
-                        <pic:spPr>
-                          <a:xfrm>
-                            <a:off x="0" y="0"/>
-                            <a:ext cx="5486400" cy="3227832"/>
-                          </a:xfrm>
-                          <a:prstGeom prst="rect"/>
-                        </pic:spPr>
-                      </pic:pic>
-                    </a:graphicData>
-                  </a:graphic>
-                </wp:inline>
-              </w:drawing>
-            </w:r>
-          </w:p>
-        </w:tc>
-      </w:tr>
-    </w:tbl>
-    <w:p>
-      <w:pPr>
-        <w:spacing w:before="100" w:after="200"/>
-        <w:jc w:val="center"/>
-        <w:rPr>
-          <w:rFonts w:asciiTheme="majorHAnsi" w:hAnsiTheme="majorHAnsi"/>
-        </w:rPr>
-      </w:pPr>
-      <w:r>
-        <w:rPr>
-          <w:rFonts w:asciiTheme="majorHAnsi" w:hAnsiTheme="majorHAnsi"/>
-          <w:i/>
-          <w:iCs/>
-          <w:color w:val="555555"/>
-        </w:rPr>
-        <w:t>Module Rapports — filtres de période, onglet Résumé (montant encaissé, paiements acceptés, passages accordés, taux d'accès)</w:t>
-      </w:r>
-    </w:p>
-    <w:p>
-      <w:pPr>
-        <w:pStyle w:val="Titre2"/>
-        <w:rPr>
-          <w:rFonts w:asciiTheme="majorHAnsi" w:hAnsiTheme="majorHAnsi"/>
-          <w:sz w:val="22"/>
-          <w:szCs w:val="22"/>
-        </w:rPr>
-      </w:pPr>
-      <w:r>
-        <w:rPr>
-          <w:rFonts w:asciiTheme="majorHAnsi" w:hAnsiTheme="majorHAnsi"/>
-          <w:sz w:val="22"/>
-          <w:szCs w:val="22"/>
-        </w:rPr>
-        <w:t>14.1 Générer un rapport</w:t>
-      </w:r>
-    </w:p>
-    <w:p>
-      <w:pPr>
-        <w:pStyle w:val="Paragraphedeliste"/>
-        <w:numPr>
-          <w:ilvl w:val="0"/>
-          <w:numId w:val="3"/>
-        </w:numPr>
-        <w:spacing w:after="80"/>
-        <w:rPr>
-          <w:rFonts w:asciiTheme="majorHAnsi" w:hAnsiTheme="majorHAnsi"/>
-        </w:rPr>
-      </w:pPr>
-      <w:r>
-        <w:rPr>
-          <w:rFonts w:asciiTheme="majorHAnsi" w:hAnsiTheme="majorHAnsi"/>
-        </w:rPr>
-        <w:t>Cliquez sur 📊 Rapports dans le menu.</w:t>
-      </w:r>
-    </w:p>
-    <w:p>
-      <w:pPr>
-        <w:pStyle w:val="Paragraphedeliste"/>
-        <w:numPr>
-          <w:ilvl w:val="0"/>
-          <w:numId w:val="3"/>
-        </w:numPr>
-        <w:spacing w:after="80"/>
-        <w:rPr>
-          <w:rFonts w:asciiTheme="majorHAnsi" w:hAnsiTheme="majorHAnsi"/>
-        </w:rPr>
-      </w:pPr>
-      <w:r>
-        <w:rPr>
-          <w:rFonts w:asciiTheme="majorHAnsi" w:hAnsiTheme="majorHAnsi"/>
-        </w:rPr>
-        <w:t>Choisissez une Date début et une Date fin.</w:t>
-      </w:r>
-    </w:p>
-    <w:p>
-      <w:pPr>
-        <w:pStyle w:val="Paragraphedeliste"/>
-        <w:numPr>
-          <w:ilvl w:val="0"/>
-          <w:numId w:val="3"/>
-        </w:numPr>
-        <w:spacing w:after="80"/>
-        <w:rPr>
-          <w:rFonts w:asciiTheme="majorHAnsi" w:hAnsiTheme="majorHAnsi"/>
-        </w:rPr>
-      </w:pPr>
-      <w:r>
-        <w:rPr>
-          <w:rFonts w:asciiTheme="majorHAnsi" w:hAnsiTheme="majorHAnsi"/>
-        </w:rPr>
-        <w:t>(Optionnel) Sélectionnez un Établissement pour restreindre les passages du rapport.</w:t>
-      </w:r>
-    </w:p>
-    <w:p>
-      <w:pPr>
-        <w:pStyle w:val="Paragraphedeliste"/>
-        <w:numPr>
-          <w:ilvl w:val="0"/>
-          <w:numId w:val="3"/>
-        </w:numPr>
-        <w:spacing w:after="80"/>
-        <w:rPr>
-          <w:rFonts w:asciiTheme="majorHAnsi" w:hAnsiTheme="majorHAnsi"/>
-        </w:rPr>
-      </w:pPr>
-      <w:r>
-        <w:rPr>
-          <w:rFonts w:asciiTheme="majorHAnsi" w:hAnsiTheme="majorHAnsi"/>
-        </w:rPr>
-        <w:t>Cliquez sur Générer le rapport.</w:t>
-      </w:r>
-    </w:p>
-    <w:p>
-      <w:pPr>
-        <w:pStyle w:val="Titre2"/>
-        <w:rPr>
-          <w:rFonts w:asciiTheme="majorHAnsi" w:hAnsiTheme="majorHAnsi"/>
-          <w:sz w:val="22"/>
-          <w:szCs w:val="22"/>
-        </w:rPr>
-      </w:pPr>
-      <w:r>
-        <w:rPr>
-          <w:rFonts w:asciiTheme="majorHAnsi" w:hAnsiTheme="majorHAnsi"/>
-          <w:sz w:val="22"/>
-          <w:szCs w:val="22"/>
-        </w:rPr>
-        <w:t>14.2 Onglets Résumé / Paiements / Passages</w:t>
-      </w:r>
-    </w:p>
-    <w:p>
-      <w:pPr>
-        <w:spacing w:after="160"/>
-        <w:rPr>
-          <w:rFonts w:asciiTheme="majorHAnsi" w:hAnsiTheme="majorHAnsi"/>
-        </w:rPr>
-      </w:pPr>
-      <w:r>
-        <w:rPr>
-          <w:rFonts w:asciiTheme="majorHAnsi" w:hAnsiTheme="majorHAnsi"/>
-        </w:rPr>
-        <w:t>Une fois le rapport généré, trois onglets structurent le contenu :</w:t>
-      </w:r>
-    </w:p>
-    <w:p>
-      <w:pPr>
-        <w:pStyle w:val="Paragraphedeliste"/>
-        <w:numPr>
-          <w:ilvl w:val="0"/>
-          <w:numId w:val="3"/>
-        </w:numPr>
-        <w:spacing w:after="80"/>
-        <w:rPr>
-          <w:rFonts w:asciiTheme="majorHAnsi" w:hAnsiTheme="majorHAnsi"/>
-        </w:rPr>
-      </w:pPr>
-      <w:r>
-        <w:rPr>
-          <w:rFonts w:asciiTheme="majorHAnsi" w:hAnsiTheme="majorHAnsi"/>
-        </w:rPr>
-        <w:t>Résumé — indicateurs clés : montant total encaissé, répartition des paiements par statut, répartition des passages par résultat, taux d'accès</w:t>
-      </w:r>
-    </w:p>
-    <w:p>
-      <w:pPr>
-        <w:pStyle w:val="Paragraphedeliste"/>
-        <w:numPr>
-          <w:ilvl w:val="0"/>
-          <w:numId w:val="3"/>
-        </w:numPr>
-        <w:spacing w:after="80"/>
-        <w:rPr>
-          <w:rFonts w:asciiTheme="majorHAnsi" w:hAnsiTheme="majorHAnsi"/>
-        </w:rPr>
-      </w:pPr>
-      <w:r>
-        <w:rPr>
-          <w:rFonts w:asciiTheme="majorHAnsi" w:hAnsiTheme="majorHAnsi"/>
-        </w:rPr>
-        <w:t>Paiements — liste détaillée des transactions de la période</w:t>
-      </w:r>
-    </w:p>
-    <w:p>
-      <w:pPr>
-        <w:pStyle w:val="Paragraphedeliste"/>
-        <w:numPr>
-          <w:ilvl w:val="0"/>
-          <w:numId w:val="3"/>
-        </w:numPr>
-        <w:spacing w:after="80"/>
-        <w:rPr>
-          <w:rFonts w:asciiTheme="majorHAnsi" w:hAnsiTheme="majorHAnsi"/>
-        </w:rPr>
-      </w:pPr>
-      <w:r>
-        <w:rPr>
-          <w:rFonts w:asciiTheme="majorHAnsi" w:hAnsiTheme="majorHAnsi"/>
-        </w:rPr>
-        <w:t>Passages — liste détaillée des passages réfectoire de la période</w:t>
-      </w:r>
-    </w:p>
-    <w:tbl>
-      <w:tblPr>
-        <w:tblW w:type="auto" w:w="0"/>
-        <w:tblLook w:firstColumn="1" w:firstRow="1" w:lastColumn="0" w:lastRow="0" w:noHBand="0" w:noVBand="1" w:val="04A0"/>
-      </w:tblPr>
-      <w:tblGrid>
-        <w:gridCol w:w="10080"/>
-      </w:tblGrid>
-      <w:tr>
-        <w:tc>
-          <w:tcPr>
-            <w:tcW w:w="6252" w:type="dxa"/>
-            <w:tcBorders>
-              <w:top w:val="single" w:sz="4" w:space="0" w:color="CCCCCC"/>
-              <w:left w:val="single" w:sz="4" w:space="0" w:color="CCCCCC"/>
-              <w:bottom w:val="single" w:sz="4" w:space="0" w:color="CCCCCC"/>
-              <w:right w:val="single" w:sz="4" w:space="0" w:color="CCCCCC"/>
-            </w:tcBorders>
-            <w:tcMar>
-              <w:top w:w="100" w:type="dxa"/>
-              <w:left w:w="100" w:type="dxa"/>
-              <w:bottom w:w="100" w:type="dxa"/>
-              <w:right w:w="100" w:type="dxa"/>
-            </w:tcMar>
-          </w:tcPr>
-          <w:p>
-            <w:pPr>
-              <w:jc w:val="center"/>
-              <w:rPr>
-                <w:rFonts w:asciiTheme="majorHAnsi" w:hAnsiTheme="majorHAnsi"/>
-              </w:rPr>
-            </w:pPr>
-            <w:r>
-              <w:drawing>
-                <wp:inline xmlns:a="http://schemas.openxmlformats.org/drawingml/2006/main" xmlns:pic="http://schemas.openxmlformats.org/drawingml/2006/picture">
-                  <wp:extent cx="5486400" cy="2834640"/>
-                  <wp:docPr id="1883468450" name="Picture 1883468450"/>
-                  <wp:cNvGraphicFramePr>
-                    <a:graphicFrameLocks noChangeAspect="1"/>
-                  </wp:cNvGraphicFramePr>
-                  <a:graphic>
-                    <a:graphicData uri="http://schemas.openxmlformats.org/drawingml/2006/picture">
-                      <pic:pic>
-                        <pic:nvPicPr>
-                          <pic:cNvPr id="0" name="rapports-paiements.png"/>
-                          <pic:cNvPicPr/>
-                        </pic:nvPicPr>
-                        <pic:blipFill>
-                          <a:blip r:embed="rId34"/>
-                          <a:stretch>
-                            <a:fillRect/>
-                          </a:stretch>
-                        </pic:blipFill>
-                        <pic:spPr>
-                          <a:xfrm>
-                            <a:off x="0" y="0"/>
-                            <a:ext cx="5486400" cy="2834640"/>
-                          </a:xfrm>
-                          <a:prstGeom prst="rect"/>
-                        </pic:spPr>
-                      </pic:pic>
-                    </a:graphicData>
-                  </a:graphic>
-                </wp:inline>
-              </w:drawing>
-            </w:r>
-          </w:p>
-        </w:tc>
-      </w:tr>
-    </w:tbl>
-    <w:p>
-      <w:pPr>
-        <w:spacing w:before="100" w:after="200"/>
-        <w:jc w:val="center"/>
-        <w:rPr>
-          <w:rFonts w:asciiTheme="majorHAnsi" w:hAnsiTheme="majorHAnsi"/>
-        </w:rPr>
-      </w:pPr>
-      <w:r>
-        <w:rPr>
-          <w:rFonts w:asciiTheme="majorHAnsi" w:hAnsiTheme="majorHAnsi"/>
-          <w:i/>
-          <w:iCs/>
-          <w:color w:val="555555"/>
-        </w:rPr>
-        <w:t>Onglet Paiements du rapport — liste détaillée de la période sélectionnée</w:t>
-      </w:r>
-    </w:p>
-    <w:tbl>
-      <w:tblPr>
-        <w:tblW w:type="auto" w:w="0"/>
-        <w:tblLook w:firstColumn="1" w:firstRow="1" w:lastColumn="0" w:lastRow="0" w:noHBand="0" w:noVBand="1" w:val="04A0"/>
-      </w:tblPr>
-      <w:tblGrid>
-        <w:gridCol w:w="10080"/>
-      </w:tblGrid>
-      <w:tr>
-        <w:tc>
-          <w:tcPr>
-            <w:tcW w:w="6252" w:type="dxa"/>
-            <w:tcBorders>
-              <w:top w:val="single" w:sz="4" w:space="0" w:color="CCCCCC"/>
-              <w:left w:val="single" w:sz="4" w:space="0" w:color="CCCCCC"/>
-              <w:bottom w:val="single" w:sz="4" w:space="0" w:color="CCCCCC"/>
-              <w:right w:val="single" w:sz="4" w:space="0" w:color="CCCCCC"/>
-            </w:tcBorders>
-            <w:tcMar>
-              <w:top w:w="100" w:type="dxa"/>
-              <w:left w:w="100" w:type="dxa"/>
-              <w:bottom w:w="100" w:type="dxa"/>
-              <w:right w:w="100" w:type="dxa"/>
-            </w:tcMar>
-          </w:tcPr>
-          <w:p>
-            <w:pPr>
-              <w:jc w:val="center"/>
-              <w:rPr>
-                <w:rFonts w:asciiTheme="majorHAnsi" w:hAnsiTheme="majorHAnsi"/>
-              </w:rPr>
-            </w:pPr>
-            <w:r>
-              <w:drawing>
-                <wp:inline xmlns:a="http://schemas.openxmlformats.org/drawingml/2006/main" xmlns:pic="http://schemas.openxmlformats.org/drawingml/2006/picture">
-                  <wp:extent cx="5486400" cy="2834640"/>
-                  <wp:docPr id="1883468451" name="Picture 1883468451"/>
-                  <wp:cNvGraphicFramePr>
-                    <a:graphicFrameLocks noChangeAspect="1"/>
-                  </wp:cNvGraphicFramePr>
-                  <a:graphic>
-                    <a:graphicData uri="http://schemas.openxmlformats.org/drawingml/2006/picture">
-                      <pic:pic>
-                        <pic:nvPicPr>
-                          <pic:cNvPr id="0" name="rapports-passages.png"/>
-                          <pic:cNvPicPr/>
-                        </pic:nvPicPr>
-                        <pic:blipFill>
-                          <a:blip r:embed="rId35"/>
-                          <a:stretch>
-                            <a:fillRect/>
-                          </a:stretch>
-                        </pic:blipFill>
-                        <pic:spPr>
-                          <a:xfrm>
-                            <a:off x="0" y="0"/>
-                            <a:ext cx="5486400" cy="2834640"/>
-                          </a:xfrm>
-                          <a:prstGeom prst="rect"/>
-                        </pic:spPr>
-                      </pic:pic>
-                    </a:graphicData>
-                  </a:graphic>
-                </wp:inline>
-              </w:drawing>
-            </w:r>
-          </w:p>
-        </w:tc>
-      </w:tr>
-    </w:tbl>
-    <w:p>
-      <w:pPr>
-        <w:spacing w:before="100" w:after="200"/>
-        <w:jc w:val="center"/>
-        <w:rPr>
-          <w:rFonts w:asciiTheme="majorHAnsi" w:hAnsiTheme="majorHAnsi"/>
-        </w:rPr>
-      </w:pPr>
-      <w:r>
-        <w:rPr>
-          <w:rFonts w:asciiTheme="majorHAnsi" w:hAnsiTheme="majorHAnsi"/>
-          <w:i/>
-          <w:iCs/>
-          <w:color w:val="555555"/>
-        </w:rPr>
-        <w:t>Onglet Passages du rapport — liste détaillée des passages réfectoire de la période</w:t>
-      </w:r>
-    </w:p>
-    <w:p>
-      <w:pPr>
-        <w:pStyle w:val="Titre2"/>
-        <w:rPr>
-          <w:rFonts w:asciiTheme="majorHAnsi" w:hAnsiTheme="majorHAnsi"/>
-          <w:sz w:val="22"/>
-          <w:szCs w:val="22"/>
-        </w:rPr>
-      </w:pPr>
-      <w:r>
-        <w:rPr>
-          <w:rFonts w:asciiTheme="majorHAnsi" w:hAnsiTheme="majorHAnsi"/>
-          <w:sz w:val="22"/>
-          <w:szCs w:val="22"/>
-        </w:rPr>
-        <w:t>14.3 Exporter en Excel</w:t>
-      </w:r>
-    </w:p>
-    <w:p>
-      <w:pPr>
-        <w:spacing w:after="160"/>
-        <w:rPr>
-          <w:rFonts w:asciiTheme="majorHAnsi" w:hAnsiTheme="majorHAnsi"/>
-        </w:rPr>
-      </w:pPr>
-      <w:r>
-        <w:rPr>
-          <w:rFonts w:asciiTheme="majorHAnsi" w:hAnsiTheme="majorHAnsi"/>
-        </w:rPr>
-        <w:t>Le bouton Exporter Excel télécharge un classeur .xlsx contenant 3 feuilles — Résumé, Paiements et Passages — couvrant toute la période sélectionnée (pas seulement les lignes visibles à l'écran).</w:t>
-      </w:r>
-    </w:p>
-    <w:p>
-      <w:pPr>
-        <w:pStyle w:val="Titre2"/>
-        <w:rPr>
-          <w:rFonts w:asciiTheme="majorHAnsi" w:hAnsiTheme="majorHAnsi"/>
-          <w:sz w:val="22"/>
-          <w:szCs w:val="22"/>
-        </w:rPr>
-      </w:pPr>
-      <w:r>
-        <w:rPr>
-          <w:rFonts w:asciiTheme="majorHAnsi" w:hAnsiTheme="majorHAnsi"/>
-          <w:sz w:val="22"/>
-          <w:szCs w:val="22"/>
-        </w:rPr>
-        <w:t>14.4 Imprimer / PDF</w:t>
-      </w:r>
-    </w:p>
-    <w:p>
-      <w:pPr>
-        <w:spacing w:after="160"/>
-        <w:rPr>
-          <w:rFonts w:asciiTheme="majorHAnsi" w:hAnsiTheme="majorHAnsi"/>
-        </w:rPr>
-      </w:pPr>
-      <w:r>
-        <w:rPr>
-          <w:rFonts w:asciiTheme="majorHAnsi" w:hAnsiTheme="majorHAnsi"/>
-        </w:rPr>
-        <w:t>Sur chaque onglet, le bouton Imprimer / PDF ouvre la boîte de dialogue d'impression du navigateur, limitée au contenu de l'onglet actif. Choisissez « Enregistrer au format PDF » comme imprimante pour obtenir un fichier PDF.</w:t>
-      </w:r>
     </w:p>
     <w:sectPr>
       <w:headerReference w:type="default" r:id="rId26"/>

</xml_diff>